<commit_message>
docs: shrink S4 CFG figures so each caption stays on the same page
</commit_message>
<xml_diff>
--- a/S4/docs/S4-5-第六组.docx
+++ b/S4/docs/S4-5-第六组.docx
@@ -948,6 +948,8 @@
     </w:p>
     <w:p>
       <w:pPr>
+        <w:keepNext w:val="0"/>
+        <w:keepLines/>
         <w:spacing w:after="40" w:line="360" w:lineRule="auto"/>
         <w:ind w:firstLine="480"/>
         <w:jc w:val="center"/>
@@ -966,7 +968,7 @@
         <w:lastRenderedPageBreak/>
         <w:drawing>
           <wp:inline distT="0" distB="0" distL="0" distR="0" wp14:anchorId="77F97EAF" wp14:editId="2A8CF42D">
-            <wp:extent cx="4492625" cy="8345838"/>
+            <wp:extent cx="3488230" cy="6480000"/>
             <wp:effectExtent l="0" t="0" r="3175" b="0"/>
             <wp:docPr id="948580672" name="图形 6"/>
             <wp:cNvGraphicFramePr>
@@ -982,7 +984,7 @@
                   <pic:blipFill>
                     <a:blip r:embed="rId8">
                       <a:extLst>
-                        <a:ext uri="{96DAC541-7B7A-43D3-8B79-37D633B846F1}">
+                        <a:ext uri="{96DAC541-7B7A-43D3-8B79-37D633B846F1}" cx="3488230" cy="6480000">
                           <asvg:svgBlip xmlns:asvg="http://schemas.microsoft.com/office/drawing/2016/SVG/main" r:embed="rId9"/>
                         </a:ext>
                       </a:extLst>
@@ -994,7 +996,7 @@
                   <pic:spPr>
                     <a:xfrm>
                       <a:off x="0" y="0"/>
-                      <a:ext cx="4497932" cy="8355697"/>
+                      <a:ext cx="3488230" cy="6480000"/>
                     </a:xfrm>
                     <a:prstGeom prst="rect">
                       <a:avLst/>
@@ -1058,6 +1060,8 @@
     </w:p>
     <w:p>
       <w:pPr>
+        <w:keepNext w:val="0"/>
+        <w:keepLines/>
         <w:spacing w:after="40" w:line="360" w:lineRule="auto"/>
         <w:ind w:firstLine="480"/>
         <w:jc w:val="center"/>
@@ -1076,7 +1080,7 @@
         <w:lastRenderedPageBreak/>
         <w:drawing>
           <wp:inline distT="0" distB="0" distL="0" distR="0" wp14:anchorId="55080EC8" wp14:editId="6D3BBB1F">
-            <wp:extent cx="3716655" cy="8469823"/>
+            <wp:extent cx="2843497" cy="6480000"/>
             <wp:effectExtent l="0" t="0" r="4445" b="1270"/>
             <wp:docPr id="1296414177" name="图片 2"/>
             <wp:cNvGraphicFramePr>
@@ -1092,7 +1096,7 @@
                   <pic:blipFill>
                     <a:blip r:embed="rId10" cstate="print">
                       <a:extLst>
-                        <a:ext uri="{28A0092B-C50C-407E-A947-70E740481C1C}">
+                        <a:ext uri="{28A0092B-C50C-407E-A947-70E740481C1C}" cx="2843497" cy="6480000">
                           <a14:useLocalDpi xmlns:a14="http://schemas.microsoft.com/office/drawing/2010/main" val="0"/>
                         </a:ext>
                       </a:extLst>
@@ -1104,7 +1108,7 @@
                   <pic:spPr>
                     <a:xfrm>
                       <a:off x="0" y="0"/>
-                      <a:ext cx="3778558" cy="8610893"/>
+                      <a:ext cx="2843497" cy="6480000"/>
                     </a:xfrm>
                     <a:prstGeom prst="rect">
                       <a:avLst/>
@@ -1168,6 +1172,8 @@
     </w:p>
     <w:p>
       <w:pPr>
+        <w:keepNext w:val="0"/>
+        <w:keepLines/>
         <w:spacing w:after="120" w:line="360" w:lineRule="auto"/>
         <w:jc w:val="center"/>
         <w:rPr>
@@ -1187,7 +1193,7 @@
         <w:lastRenderedPageBreak/>
         <w:drawing>
           <wp:inline distT="0" distB="0" distL="0" distR="0" wp14:anchorId="11F2975F" wp14:editId="25B8F5AB">
-            <wp:extent cx="3279775" cy="8314841"/>
+            <wp:extent cx="2556025" cy="6480000"/>
             <wp:effectExtent l="0" t="0" r="0" b="3810"/>
             <wp:docPr id="659936176" name="图片 3"/>
             <wp:cNvGraphicFramePr>
@@ -1203,7 +1209,7 @@
                   <pic:blipFill>
                     <a:blip r:embed="rId11" cstate="print">
                       <a:extLst>
-                        <a:ext uri="{28A0092B-C50C-407E-A947-70E740481C1C}">
+                        <a:ext uri="{28A0092B-C50C-407E-A947-70E740481C1C}" cx="2556025" cy="6480000">
                           <a14:useLocalDpi xmlns:a14="http://schemas.microsoft.com/office/drawing/2010/main" val="0"/>
                         </a:ext>
                       </a:extLst>
@@ -1215,7 +1221,7 @@
                   <pic:spPr>
                     <a:xfrm>
                       <a:off x="0" y="0"/>
-                      <a:ext cx="3286424" cy="8331697"/>
+                      <a:ext cx="2556025" cy="6480000"/>
                     </a:xfrm>
                     <a:prstGeom prst="rect">
                       <a:avLst/>

</xml_diff>